<commit_message>
doc: add Model Selection Research document
</commit_message>
<xml_diff>
--- a/Decision Logs/Decision-log-2-Model-decision(Updated).docx
+++ b/Decision Logs/Decision-log-2-Model-decision(Updated).docx
@@ -24,17 +24,7 @@
           <w:sz w:val="44"/>
           <w:szCs w:val="44"/>
         </w:rPr>
-        <w:t>Decision Log – 2</w:t>
-      </w:r>
-      <w:r>
-        <w:rPr>
-          <w:rFonts w:ascii="Calibri" w:hAnsi="Calibri" w:cs="Calibri"/>
-          <w:b/>
-          <w:bCs/>
-          <w:sz w:val="44"/>
-          <w:szCs w:val="44"/>
-        </w:rPr>
-        <w:t xml:space="preserve"> - Updated</w:t>
+        <w:t>Decision Log – 2 - Updated</w:t>
       </w:r>
     </w:p>
     <w:p>
@@ -169,41 +159,174 @@
         </w:rPr>
         <w:br/>
       </w:r>
-    </w:p>
-    <w:p>
-      <w:pPr>
-        <w:rPr>
-          <w:rFonts w:ascii="Cambria" w:hAnsi="Cambria"/>
-        </w:rPr>
-      </w:pPr>
-      <w:r>
-        <w:rPr>
-          <w:rFonts w:ascii="Cambria" w:hAnsi="Cambria"/>
-          <w:b/>
-          <w:bCs/>
-        </w:rPr>
-        <w:t>Where this fits:</w:t>
+      <w:r>
+        <w:rPr>
+          <w:rFonts w:ascii="Cambria" w:hAnsi="Cambria"/>
+        </w:rPr>
+        <w:pict w14:anchorId="2265B7A0">
+          <v:rect id="_x0000_i1025" style="width:0;height:1.5pt" o:hralign="center" o:hrstd="t" o:hr="t" fillcolor="#a0a0a0" stroked="f"/>
+        </w:pict>
+      </w:r>
+    </w:p>
+    <w:p>
+      <w:pPr>
+        <w:pStyle w:val="Heading2"/>
+        <w:rPr>
+          <w:rFonts w:ascii="Calibri" w:hAnsi="Calibri" w:cs="Calibri"/>
+        </w:rPr>
+      </w:pPr>
+      <w:r>
+        <w:rPr>
+          <w:rFonts w:ascii="Calibri" w:hAnsi="Calibri" w:cs="Calibri"/>
+        </w:rPr>
+        <w:t>1. Research Question</w:t>
+      </w:r>
+    </w:p>
+    <w:p>
+      <w:pPr>
+        <w:rPr>
+          <w:rFonts w:ascii="Cambria" w:hAnsi="Cambria"/>
+        </w:rPr>
+      </w:pPr>
+      <w:r>
+        <w:rPr>
+          <w:rFonts w:ascii="Cambria" w:hAnsi="Cambria"/>
+        </w:rPr>
+        <w:t>Which LLM models should be selected to represent different categories of the current LLM ecosystem when benchmarking real programming questions using the StackEval approach?</w:t>
+      </w:r>
+    </w:p>
+    <w:p>
+      <w:pPr>
+        <w:rPr>
+          <w:rFonts w:ascii="Cambria" w:hAnsi="Cambria"/>
+        </w:rPr>
+      </w:pPr>
+      <w:r>
+        <w:rPr>
+          <w:rFonts w:ascii="Cambria" w:hAnsi="Cambria"/>
+        </w:rPr>
+        <w:pict w14:anchorId="33423D35">
+          <v:rect id="_x0000_i1026" style="width:0;height:1.5pt" o:hralign="center" o:hrstd="t" o:hr="t" fillcolor="#a0a0a0" stroked="f"/>
+        </w:pict>
+      </w:r>
+    </w:p>
+    <w:p>
+      <w:pPr>
+        <w:pStyle w:val="Heading2"/>
+        <w:rPr>
+          <w:rFonts w:ascii="Calibri" w:hAnsi="Calibri" w:cs="Calibri"/>
+        </w:rPr>
+      </w:pPr>
+      <w:r>
+        <w:rPr>
+          <w:rFonts w:ascii="Calibri" w:hAnsi="Calibri" w:cs="Calibri"/>
+        </w:rPr>
+        <w:t>2. Current Learning Outcome (LO) Stage</w:t>
+      </w:r>
+    </w:p>
+    <w:p>
+      <w:pPr>
+        <w:rPr>
+          <w:rFonts w:ascii="Cambria" w:hAnsi="Cambria"/>
+        </w:rPr>
+      </w:pPr>
+      <w:r>
+        <w:rPr>
+          <w:rFonts w:ascii="Segoe UI Symbol" w:hAnsi="Segoe UI Symbol" w:cs="Segoe UI Symbol"/>
+        </w:rPr>
+        <w:t>☑</w:t>
+      </w:r>
+      <w:r>
+        <w:rPr>
+          <w:rFonts w:ascii="Cambria" w:hAnsi="Cambria"/>
+        </w:rPr>
+        <w:t xml:space="preserve"> Analyzing</w:t>
       </w:r>
       <w:r>
         <w:rPr>
           <w:rFonts w:ascii="Cambria" w:hAnsi="Cambria"/>
         </w:rPr>
         <w:br/>
-        <w:t>StackEval Benchmark project scope – evaluation of LLMs on real Stack Overflow programming questions.</w:t>
-      </w:r>
-    </w:p>
-    <w:p>
-      <w:pPr>
-        <w:rPr>
-          <w:rFonts w:ascii="Cambria" w:hAnsi="Cambria"/>
-        </w:rPr>
-      </w:pPr>
-      <w:r>
-        <w:rPr>
-          <w:rFonts w:ascii="Cambria" w:hAnsi="Cambria"/>
-        </w:rPr>
-        <w:pict w14:anchorId="2265B7A0">
-          <v:rect id="_x0000_i1121" style="width:0;height:1.5pt" o:hralign="center" o:hrstd="t" o:hr="t" fillcolor="#a0a0a0" stroked="f"/>
+      </w:r>
+      <w:r>
+        <w:rPr>
+          <w:rFonts w:ascii="Segoe UI Symbol" w:hAnsi="Segoe UI Symbol" w:cs="Segoe UI Symbol"/>
+        </w:rPr>
+        <w:t>☑</w:t>
+      </w:r>
+      <w:r>
+        <w:rPr>
+          <w:rFonts w:ascii="Cambria" w:hAnsi="Cambria"/>
+        </w:rPr>
+        <w:t xml:space="preserve"> Advising</w:t>
+      </w:r>
+      <w:r>
+        <w:rPr>
+          <w:rFonts w:ascii="Cambria" w:hAnsi="Cambria"/>
+        </w:rPr>
+        <w:br/>
+      </w:r>
+      <w:r>
+        <w:rPr>
+          <w:rFonts w:ascii="Segoe UI Symbol" w:hAnsi="Segoe UI Symbol" w:cs="Segoe UI Symbol"/>
+        </w:rPr>
+        <w:t>☐</w:t>
+      </w:r>
+      <w:r>
+        <w:rPr>
+          <w:rFonts w:ascii="Cambria" w:hAnsi="Cambria"/>
+        </w:rPr>
+        <w:t xml:space="preserve"> Designing</w:t>
+      </w:r>
+      <w:r>
+        <w:rPr>
+          <w:rFonts w:ascii="Cambria" w:hAnsi="Cambria"/>
+        </w:rPr>
+        <w:br/>
+      </w:r>
+      <w:r>
+        <w:rPr>
+          <w:rFonts w:ascii="Segoe UI Symbol" w:hAnsi="Segoe UI Symbol" w:cs="Segoe UI Symbol"/>
+        </w:rPr>
+        <w:t>☐</w:t>
+      </w:r>
+      <w:r>
+        <w:rPr>
+          <w:rFonts w:ascii="Cambria" w:hAnsi="Cambria"/>
+        </w:rPr>
+        <w:t xml:space="preserve"> Realizing</w:t>
+      </w:r>
+      <w:r>
+        <w:rPr>
+          <w:rFonts w:ascii="Cambria" w:hAnsi="Cambria"/>
+        </w:rPr>
+        <w:br/>
+      </w:r>
+      <w:r>
+        <w:rPr>
+          <w:rFonts w:ascii="Segoe UI Symbol" w:hAnsi="Segoe UI Symbol" w:cs="Segoe UI Symbol"/>
+        </w:rPr>
+        <w:t>☐</w:t>
+      </w:r>
+      <w:r>
+        <w:rPr>
+          <w:rFonts w:ascii="Cambria" w:hAnsi="Cambria"/>
+        </w:rPr>
+        <w:t xml:space="preserve"> Managing</w:t>
+      </w:r>
+    </w:p>
+    <w:p>
+      <w:pPr>
+        <w:rPr>
+          <w:rFonts w:ascii="Cambria" w:hAnsi="Cambria"/>
+        </w:rPr>
+      </w:pPr>
+      <w:r>
+        <w:rPr>
+          <w:rFonts w:ascii="Cambria" w:hAnsi="Cambria"/>
+        </w:rPr>
+        <w:pict w14:anchorId="0F32EA0E">
+          <v:rect id="_x0000_i1027" style="width:0;height:1.5pt" o:hralign="center" o:hrstd="t" o:hr="t" fillcolor="#a0a0a0" stroked="f"/>
         </w:pict>
       </w:r>
     </w:p>
@@ -218,68 +341,49 @@
         <w:rPr>
           <w:rFonts w:ascii="Calibri" w:hAnsi="Calibri" w:cs="Calibri"/>
         </w:rPr>
-        <w:t>1. Research Question</w:t>
-      </w:r>
-    </w:p>
-    <w:p>
-      <w:pPr>
-        <w:rPr>
-          <w:rFonts w:ascii="Cambria" w:hAnsi="Cambria"/>
-        </w:rPr>
-      </w:pPr>
-      <w:r>
-        <w:rPr>
-          <w:rFonts w:ascii="Cambria" w:hAnsi="Cambria"/>
-        </w:rPr>
-        <w:t>Which LLM models should be selected to represent different categories of the current LLM ecosystem when benchmarking real programming questions using the StackEval approach?</w:t>
-      </w:r>
-    </w:p>
-    <w:p>
-      <w:pPr>
-        <w:rPr>
-          <w:rFonts w:ascii="Cambria" w:hAnsi="Cambria"/>
-        </w:rPr>
-      </w:pPr>
-      <w:r>
-        <w:rPr>
-          <w:rFonts w:ascii="Cambria" w:hAnsi="Cambria"/>
-        </w:rPr>
-        <w:pict w14:anchorId="33423D35">
-          <v:rect id="_x0000_i1122" style="width:0;height:1.5pt" o:hralign="center" o:hrstd="t" o:hr="t" fillcolor="#a0a0a0" stroked="f"/>
-        </w:pict>
-      </w:r>
-    </w:p>
-    <w:p>
-      <w:pPr>
-        <w:pStyle w:val="Heading2"/>
-        <w:rPr>
-          <w:rFonts w:ascii="Calibri" w:hAnsi="Calibri" w:cs="Calibri"/>
-        </w:rPr>
-      </w:pPr>
-      <w:r>
-        <w:rPr>
-          <w:rFonts w:ascii="Calibri" w:hAnsi="Calibri" w:cs="Calibri"/>
-        </w:rPr>
-        <w:t>2. Current Learning Outcome (LO) Stage</w:t>
-      </w:r>
-    </w:p>
-    <w:p>
-      <w:pPr>
-        <w:rPr>
-          <w:rFonts w:ascii="Cambria" w:hAnsi="Cambria"/>
-        </w:rPr>
-      </w:pPr>
-      <w:r>
-        <w:rPr>
-          <w:rFonts w:ascii="Segoe UI Symbol" w:hAnsi="Segoe UI Symbol" w:cs="Segoe UI Symbol"/>
-        </w:rPr>
-        <w:t>☑</w:t>
-      </w:r>
-      <w:r>
-        <w:rPr>
-          <w:rFonts w:ascii="Cambria" w:hAnsi="Cambria"/>
-        </w:rPr>
-        <w:t xml:space="preserve"> Analyzing</w:t>
+        <w:t>3. What Makes a Good Decision?</w:t>
+      </w:r>
+    </w:p>
+    <w:p>
+      <w:pPr>
+        <w:rPr>
+          <w:rFonts w:ascii="Cambria" w:hAnsi="Cambria"/>
+        </w:rPr>
+      </w:pPr>
+      <w:r>
+        <w:rPr>
+          <w:rFonts w:ascii="Cambria" w:hAnsi="Cambria"/>
+          <w:b/>
+          <w:bCs/>
+        </w:rPr>
+        <w:t>Criteria for Success</w:t>
+      </w:r>
+      <w:r>
+        <w:rPr>
+          <w:rFonts w:ascii="Cambria" w:hAnsi="Cambria"/>
+          <w:b/>
+          <w:bCs/>
+        </w:rPr>
+        <w:t>:</w:t>
+      </w:r>
+    </w:p>
+    <w:p>
+      <w:pPr>
+        <w:rPr>
+          <w:rFonts w:ascii="Cambria" w:hAnsi="Cambria"/>
+        </w:rPr>
+      </w:pPr>
+      <w:r>
+        <w:rPr>
+          <w:rFonts w:ascii="Cambria" w:hAnsi="Cambria"/>
+        </w:rPr>
+        <w:t>• The experiment must include at least four models representing different LLM categories</w:t>
+      </w:r>
+      <w:r>
+        <w:rPr>
+          <w:rFonts w:ascii="Cambria" w:hAnsi="Cambria"/>
+        </w:rPr>
+        <w:t>.</w:t>
       </w:r>
       <w:r>
         <w:rPr>
@@ -289,15 +393,30 @@
       </w:r>
       <w:r>
         <w:rPr>
-          <w:rFonts w:ascii="Segoe UI Symbol" w:hAnsi="Segoe UI Symbol" w:cs="Segoe UI Symbol"/>
-        </w:rPr>
-        <w:t>☑</w:t>
-      </w:r>
-      <w:r>
-        <w:rPr>
-          <w:rFonts w:ascii="Cambria" w:hAnsi="Cambria"/>
-        </w:rPr>
-        <w:t xml:space="preserve"> Advising</w:t>
+          <w:rFonts w:ascii="Cambria" w:hAnsi="Cambria"/>
+        </w:rPr>
+        <w:lastRenderedPageBreak/>
+        <w:t xml:space="preserve">• The selected models must represent the </w:t>
+      </w:r>
+      <w:r>
+        <w:rPr>
+          <w:rFonts w:ascii="Cambria" w:hAnsi="Cambria"/>
+          <w:b/>
+          <w:bCs/>
+        </w:rPr>
+        <w:t>latest available state-of-the-art systems</w:t>
+      </w:r>
+      <w:r>
+        <w:rPr>
+          <w:rFonts w:ascii="Cambria" w:hAnsi="Cambria"/>
+        </w:rPr>
+        <w:t>, ensuring the benchmark reflects current industry capabilities.</w:t>
+      </w:r>
+      <w:r>
+        <w:rPr>
+          <w:rFonts w:ascii="Cambria" w:hAnsi="Cambria"/>
+        </w:rPr>
+        <w:t xml:space="preserve"> </w:t>
       </w:r>
       <w:r>
         <w:rPr>
@@ -307,15 +426,23 @@
       </w:r>
       <w:r>
         <w:rPr>
-          <w:rFonts w:ascii="Segoe UI Symbol" w:hAnsi="Segoe UI Symbol" w:cs="Segoe UI Symbol"/>
-        </w:rPr>
-        <w:t>☐</w:t>
-      </w:r>
-      <w:r>
-        <w:rPr>
-          <w:rFonts w:ascii="Cambria" w:hAnsi="Cambria"/>
-        </w:rPr>
-        <w:t xml:space="preserve"> Designing</w:t>
+          <w:rFonts w:ascii="Cambria" w:hAnsi="Cambria"/>
+        </w:rPr>
+        <w:t xml:space="preserve">• The models must be </w:t>
+      </w:r>
+      <w:r>
+        <w:rPr>
+          <w:rFonts w:ascii="Cambria" w:hAnsi="Cambria"/>
+          <w:b/>
+          <w:bCs/>
+        </w:rPr>
+        <w:t>API-accessible</w:t>
+      </w:r>
+      <w:r>
+        <w:rPr>
+          <w:rFonts w:ascii="Cambria" w:hAnsi="Cambria"/>
+        </w:rPr>
+        <w:t>, enabling consistent and automated querying (aligned with Decision Log 3).</w:t>
       </w:r>
       <w:r>
         <w:rPr>
@@ -325,172 +452,6 @@
       </w:r>
       <w:r>
         <w:rPr>
-          <w:rFonts w:ascii="Segoe UI Symbol" w:hAnsi="Segoe UI Symbol" w:cs="Segoe UI Symbol"/>
-        </w:rPr>
-        <w:t>☐</w:t>
-      </w:r>
-      <w:r>
-        <w:rPr>
-          <w:rFonts w:ascii="Cambria" w:hAnsi="Cambria"/>
-        </w:rPr>
-        <w:t xml:space="preserve"> Realizing</w:t>
-      </w:r>
-      <w:r>
-        <w:rPr>
-          <w:rFonts w:ascii="Cambria" w:hAnsi="Cambria"/>
-        </w:rPr>
-        <w:br/>
-      </w:r>
-      <w:r>
-        <w:rPr>
-          <w:rFonts w:ascii="Segoe UI Symbol" w:hAnsi="Segoe UI Symbol" w:cs="Segoe UI Symbol"/>
-        </w:rPr>
-        <w:t>☐</w:t>
-      </w:r>
-      <w:r>
-        <w:rPr>
-          <w:rFonts w:ascii="Cambria" w:hAnsi="Cambria"/>
-        </w:rPr>
-        <w:t xml:space="preserve"> Managing</w:t>
-      </w:r>
-    </w:p>
-    <w:p>
-      <w:pPr>
-        <w:rPr>
-          <w:rFonts w:ascii="Cambria" w:hAnsi="Cambria"/>
-        </w:rPr>
-      </w:pPr>
-      <w:r>
-        <w:rPr>
-          <w:rFonts w:ascii="Cambria" w:hAnsi="Cambria"/>
-        </w:rPr>
-        <w:pict w14:anchorId="0F32EA0E">
-          <v:rect id="_x0000_i1123" style="width:0;height:1.5pt" o:hralign="center" o:hrstd="t" o:hr="t" fillcolor="#a0a0a0" stroked="f"/>
-        </w:pict>
-      </w:r>
-    </w:p>
-    <w:p>
-      <w:pPr>
-        <w:pStyle w:val="Heading2"/>
-        <w:rPr>
-          <w:rFonts w:ascii="Calibri" w:hAnsi="Calibri" w:cs="Calibri"/>
-        </w:rPr>
-      </w:pPr>
-      <w:r>
-        <w:rPr>
-          <w:rFonts w:ascii="Calibri" w:hAnsi="Calibri" w:cs="Calibri"/>
-        </w:rPr>
-        <w:lastRenderedPageBreak/>
-        <w:t>3. What Makes a Good Decision?</w:t>
-      </w:r>
-    </w:p>
-    <w:p>
-      <w:pPr>
-        <w:rPr>
-          <w:rFonts w:ascii="Cambria" w:hAnsi="Cambria"/>
-        </w:rPr>
-      </w:pPr>
-      <w:r>
-        <w:rPr>
-          <w:rFonts w:ascii="Cambria" w:hAnsi="Cambria"/>
-          <w:b/>
-          <w:bCs/>
-        </w:rPr>
-        <w:t>Criteria for Success</w:t>
-      </w:r>
-      <w:r>
-        <w:rPr>
-          <w:rFonts w:ascii="Cambria" w:hAnsi="Cambria"/>
-          <w:b/>
-          <w:bCs/>
-        </w:rPr>
-        <w:t>:</w:t>
-      </w:r>
-    </w:p>
-    <w:p>
-      <w:pPr>
-        <w:rPr>
-          <w:rFonts w:ascii="Cambria" w:hAnsi="Cambria"/>
-        </w:rPr>
-      </w:pPr>
-      <w:r>
-        <w:rPr>
-          <w:rFonts w:ascii="Cambria" w:hAnsi="Cambria"/>
-        </w:rPr>
-        <w:t>• The experiment must include at least four models representing different LLM categories</w:t>
-      </w:r>
-      <w:r>
-        <w:rPr>
-          <w:rFonts w:ascii="Cambria" w:hAnsi="Cambria"/>
-        </w:rPr>
-        <w:t>.</w:t>
-      </w:r>
-      <w:r>
-        <w:rPr>
-          <w:rFonts w:ascii="Cambria" w:hAnsi="Cambria"/>
-        </w:rPr>
-        <w:br/>
-      </w:r>
-      <w:r>
-        <w:rPr>
-          <w:rFonts w:ascii="Cambria" w:hAnsi="Cambria"/>
-        </w:rPr>
-        <w:t xml:space="preserve">• The selected models must represent the </w:t>
-      </w:r>
-      <w:r>
-        <w:rPr>
-          <w:rFonts w:ascii="Cambria" w:hAnsi="Cambria"/>
-          <w:b/>
-          <w:bCs/>
-        </w:rPr>
-        <w:t>latest available state-of-the-art systems</w:t>
-      </w:r>
-      <w:r>
-        <w:rPr>
-          <w:rFonts w:ascii="Cambria" w:hAnsi="Cambria"/>
-        </w:rPr>
-        <w:t>, ensuring the benchmark reflects current industry capabilities.</w:t>
-      </w:r>
-      <w:r>
-        <w:rPr>
-          <w:rFonts w:ascii="Cambria" w:hAnsi="Cambria"/>
-        </w:rPr>
-        <w:t xml:space="preserve"> </w:t>
-      </w:r>
-      <w:r>
-        <w:rPr>
-          <w:rFonts w:ascii="Cambria" w:hAnsi="Cambria"/>
-        </w:rPr>
-        <w:br/>
-      </w:r>
-      <w:r>
-        <w:rPr>
-          <w:rFonts w:ascii="Cambria" w:hAnsi="Cambria"/>
-        </w:rPr>
-        <w:t xml:space="preserve">• The models must be </w:t>
-      </w:r>
-      <w:r>
-        <w:rPr>
-          <w:rFonts w:ascii="Cambria" w:hAnsi="Cambria"/>
-          <w:b/>
-          <w:bCs/>
-        </w:rPr>
-        <w:t>API-accessible</w:t>
-      </w:r>
-      <w:r>
-        <w:rPr>
-          <w:rFonts w:ascii="Cambria" w:hAnsi="Cambria"/>
-        </w:rPr>
-        <w:t>, enabling consistent and automated querying (aligned with Decision Log 3).</w:t>
-      </w:r>
-      <w:r>
-        <w:rPr>
-          <w:rFonts w:ascii="Cambria" w:hAnsi="Cambria"/>
-        </w:rPr>
-        <w:br/>
-      </w:r>
-      <w:r>
-        <w:rPr>
           <w:rFonts w:ascii="Cambria" w:hAnsi="Cambria"/>
         </w:rPr>
         <w:t>• The number of models must remain manageable to ensure feasible analysis within the project scope.</w:t>
@@ -507,7 +468,7 @@
           <w:rFonts w:ascii="Cambria" w:hAnsi="Cambria"/>
         </w:rPr>
         <w:pict w14:anchorId="2F49DFB9">
-          <v:rect id="_x0000_i1124" style="width:0;height:1.5pt" o:hralign="center" o:hrstd="t" o:hr="t" fillcolor="#a0a0a0" stroked="f"/>
+          <v:rect id="_x0000_i1028" style="width:0;height:1.5pt" o:hralign="center" o:hrstd="t" o:hr="t" fillcolor="#a0a0a0" stroked="f"/>
         </w:pict>
       </w:r>
     </w:p>
@@ -736,7 +697,7 @@
           <w:rFonts w:ascii="Cambria" w:hAnsi="Cambria"/>
         </w:rPr>
         <w:pict w14:anchorId="40187E5E">
-          <v:rect id="_x0000_i1125" style="width:0;height:1.5pt" o:hralign="center" o:hrstd="t" o:hr="t" fillcolor="#a0a0a0" stroked="f"/>
+          <v:rect id="_x0000_i1029" style="width:0;height:1.5pt" o:hralign="center" o:hrstd="t" o:hr="t" fillcolor="#a0a0a0" stroked="f"/>
         </w:pict>
       </w:r>
     </w:p>
@@ -842,41 +803,41 @@
           <w:b/>
           <w:bCs/>
         </w:rPr>
+        <w:pict w14:anchorId="708CAE14">
+          <v:rect id="_x0000_i1030" style="width:0;height:1.5pt" o:hralign="center" o:hrstd="t" o:hr="t" fillcolor="#a0a0a0" stroked="f"/>
+        </w:pict>
+      </w:r>
+    </w:p>
+    <w:p>
+      <w:pPr>
+        <w:spacing w:after="200" w:line="276" w:lineRule="auto"/>
+        <w:rPr>
+          <w:rFonts w:ascii="Cambria" w:hAnsi="Cambria"/>
+          <w:b/>
+          <w:bCs/>
+        </w:rPr>
+      </w:pPr>
+      <w:r>
+        <w:rPr>
+          <w:rFonts w:ascii="Cambria" w:hAnsi="Cambria"/>
+          <w:b/>
+          <w:bCs/>
+        </w:rPr>
+        <w:t>Observations</w:t>
+      </w:r>
+    </w:p>
+    <w:p>
+      <w:pPr>
+        <w:spacing w:after="200" w:line="276" w:lineRule="auto"/>
+        <w:rPr>
+          <w:rFonts w:ascii="Cambria" w:hAnsi="Cambria"/>
+        </w:rPr>
+      </w:pPr>
+      <w:r>
+        <w:rPr>
+          <w:rFonts w:ascii="Cambria" w:hAnsi="Cambria"/>
+        </w:rPr>
         <w:lastRenderedPageBreak/>
-        <w:pict w14:anchorId="708CAE14">
-          <v:rect id="_x0000_i1174" style="width:0;height:1.5pt" o:hralign="center" o:hrstd="t" o:hr="t" fillcolor="#a0a0a0" stroked="f"/>
-        </w:pict>
-      </w:r>
-    </w:p>
-    <w:p>
-      <w:pPr>
-        <w:spacing w:after="200" w:line="276" w:lineRule="auto"/>
-        <w:rPr>
-          <w:rFonts w:ascii="Cambria" w:hAnsi="Cambria"/>
-          <w:b/>
-          <w:bCs/>
-        </w:rPr>
-      </w:pPr>
-      <w:r>
-        <w:rPr>
-          <w:rFonts w:ascii="Cambria" w:hAnsi="Cambria"/>
-          <w:b/>
-          <w:bCs/>
-        </w:rPr>
-        <w:t>Observations</w:t>
-      </w:r>
-    </w:p>
-    <w:p>
-      <w:pPr>
-        <w:spacing w:after="200" w:line="276" w:lineRule="auto"/>
-        <w:rPr>
-          <w:rFonts w:ascii="Cambria" w:hAnsi="Cambria"/>
-        </w:rPr>
-      </w:pPr>
-      <w:r>
-        <w:rPr>
-          <w:rFonts w:ascii="Cambria" w:hAnsi="Cambria"/>
-        </w:rPr>
         <w:t xml:space="preserve">Initially, model selection was based on widely </w:t>
       </w:r>
       <w:r>
@@ -1059,7 +1020,7 @@
           <w:rFonts w:ascii="Cambria" w:hAnsi="Cambria"/>
         </w:rPr>
         <w:pict w14:anchorId="5FFF38C3">
-          <v:rect id="_x0000_i1175" style="width:0;height:1.5pt" o:hralign="center" o:hrstd="t" o:hr="t" fillcolor="#a0a0a0" stroked="f"/>
+          <v:rect id="_x0000_i1031" style="width:0;height:1.5pt" o:hralign="center" o:hrstd="t" o:hr="t" fillcolor="#a0a0a0" stroked="f"/>
         </w:pict>
       </w:r>
     </w:p>
@@ -1108,21 +1069,7 @@
             <w:rStyle w:val="Hyperlink"/>
             <w:rFonts w:ascii="Cambria" w:hAnsi="Cambria"/>
           </w:rPr>
-          <w:t>https://chatgpt.co</w:t>
-        </w:r>
-        <w:r>
-          <w:rPr>
-            <w:rStyle w:val="Hyperlink"/>
-            <w:rFonts w:ascii="Cambria" w:hAnsi="Cambria"/>
-          </w:rPr>
-          <w:t>m</w:t>
-        </w:r>
-        <w:r>
-          <w:rPr>
-            <w:rStyle w:val="Hyperlink"/>
-            <w:rFonts w:ascii="Cambria" w:hAnsi="Cambria"/>
-          </w:rPr>
-          <w:t>/share/69b7f668-b368-8002-90b6-d4634e666ecd</w:t>
+          <w:t>https://chatgpt.com/share/69b7f668-b368-8002-90b6-d4634e666ecd</w:t>
         </w:r>
       </w:hyperlink>
       <w:r>
@@ -1201,7 +1148,6 @@
           <w:b/>
           <w:bCs/>
         </w:rPr>
-        <w:lastRenderedPageBreak/>
         <w:t>OpenAI. (2026). Models API and platform overview.</w:t>
       </w:r>
       <w:r>
@@ -1220,43 +1166,7 @@
             <w:b/>
             <w:bCs/>
           </w:rPr>
-          <w:t>https://dev</w:t>
-        </w:r>
-        <w:r>
-          <w:rPr>
-            <w:rStyle w:val="Hyperlink"/>
-            <w:rFonts w:ascii="Cambria" w:hAnsi="Cambria"/>
-            <w:b/>
-            <w:bCs/>
-          </w:rPr>
-          <w:t>e</w:t>
-        </w:r>
-        <w:r>
-          <w:rPr>
-            <w:rStyle w:val="Hyperlink"/>
-            <w:rFonts w:ascii="Cambria" w:hAnsi="Cambria"/>
-            <w:b/>
-            <w:bCs/>
-          </w:rPr>
-          <w:t>l</w:t>
-        </w:r>
-        <w:r>
-          <w:rPr>
-            <w:rStyle w:val="Hyperlink"/>
-            <w:rFonts w:ascii="Cambria" w:hAnsi="Cambria"/>
-            <w:b/>
-            <w:bCs/>
-          </w:rPr>
-          <w:t>o</w:t>
-        </w:r>
-        <w:r>
-          <w:rPr>
-            <w:rStyle w:val="Hyperlink"/>
-            <w:rFonts w:ascii="Cambria" w:hAnsi="Cambria"/>
-            <w:b/>
-            <w:bCs/>
-          </w:rPr>
-          <w:t>pers.openai.com/api/docs/models</w:t>
+          <w:t>https://developers.openai.com/api/docs/models</w:t>
         </w:r>
       </w:hyperlink>
     </w:p>
@@ -1267,14 +1177,16 @@
           <w:rFonts w:ascii="Cambria" w:hAnsi="Cambria"/>
           <w:b/>
           <w:bCs/>
-        </w:rPr>
-      </w:pPr>
-      <w:r>
-        <w:rPr>
-          <w:rFonts w:ascii="Cambria" w:hAnsi="Cambria"/>
-          <w:b/>
-          <w:bCs/>
-        </w:rPr>
+          <w:lang w:val="nl-NL"/>
+        </w:rPr>
+      </w:pPr>
+      <w:r>
+        <w:rPr>
+          <w:rFonts w:ascii="Cambria" w:hAnsi="Cambria"/>
+          <w:b/>
+          <w:bCs/>
+        </w:rPr>
+        <w:lastRenderedPageBreak/>
         <w:t>Anthropic. (2026). Claude API platform.</w:t>
       </w:r>
       <w:r>
@@ -1292,26 +1204,9 @@
             <w:rFonts w:ascii="Cambria" w:hAnsi="Cambria"/>
             <w:b/>
             <w:bCs/>
+            <w:lang w:val="nl-NL"/>
           </w:rPr>
-          <w:t>https://pla</w:t>
-        </w:r>
-        <w:r>
-          <w:rPr>
-            <w:rStyle w:val="Hyperlink"/>
-            <w:rFonts w:ascii="Cambria" w:hAnsi="Cambria"/>
-            <w:b/>
-            <w:bCs/>
-          </w:rPr>
-          <w:t>t</w:t>
-        </w:r>
-        <w:r>
-          <w:rPr>
-            <w:rStyle w:val="Hyperlink"/>
-            <w:rFonts w:ascii="Cambria" w:hAnsi="Cambria"/>
-            <w:b/>
-            <w:bCs/>
-          </w:rPr>
-          <w:t>form.claude.com/docs/en/home</w:t>
+          <w:t>https://platform.claude.com/docs/en/home</w:t>
         </w:r>
       </w:hyperlink>
     </w:p>
@@ -1350,43 +1245,7 @@
             <w:b/>
             <w:bCs/>
           </w:rPr>
-          <w:t>https://</w:t>
-        </w:r>
-        <w:r>
-          <w:rPr>
-            <w:rStyle w:val="Hyperlink"/>
-            <w:rFonts w:ascii="Cambria" w:hAnsi="Cambria"/>
-            <w:b/>
-            <w:bCs/>
-          </w:rPr>
-          <w:t>o</w:t>
-        </w:r>
-        <w:r>
-          <w:rPr>
-            <w:rStyle w:val="Hyperlink"/>
-            <w:rFonts w:ascii="Cambria" w:hAnsi="Cambria"/>
-            <w:b/>
-            <w:bCs/>
-          </w:rPr>
-          <w:t>penrou</w:t>
-        </w:r>
-        <w:r>
-          <w:rPr>
-            <w:rStyle w:val="Hyperlink"/>
-            <w:rFonts w:ascii="Cambria" w:hAnsi="Cambria"/>
-            <w:b/>
-            <w:bCs/>
-          </w:rPr>
-          <w:t>t</w:t>
-        </w:r>
-        <w:r>
-          <w:rPr>
-            <w:rStyle w:val="Hyperlink"/>
-            <w:rFonts w:ascii="Cambria" w:hAnsi="Cambria"/>
-            <w:b/>
-            <w:bCs/>
-          </w:rPr>
-          <w:t>er.ai/meta-llama</w:t>
+          <w:t>https://openrouter.ai/meta-llama</w:t>
         </w:r>
       </w:hyperlink>
     </w:p>
@@ -1423,43 +1282,7 @@
             <w:b/>
             <w:bCs/>
           </w:rPr>
-          <w:t>https://</w:t>
-        </w:r>
-        <w:r>
-          <w:rPr>
-            <w:rStyle w:val="Hyperlink"/>
-            <w:rFonts w:ascii="Cambria" w:hAnsi="Cambria"/>
-            <w:b/>
-            <w:bCs/>
-          </w:rPr>
-          <w:t>w</w:t>
-        </w:r>
-        <w:r>
-          <w:rPr>
-            <w:rStyle w:val="Hyperlink"/>
-            <w:rFonts w:ascii="Cambria" w:hAnsi="Cambria"/>
-            <w:b/>
-            <w:bCs/>
-          </w:rPr>
-          <w:t>ww.prollm.ai/lead</w:t>
-        </w:r>
-        <w:r>
-          <w:rPr>
-            <w:rStyle w:val="Hyperlink"/>
-            <w:rFonts w:ascii="Cambria" w:hAnsi="Cambria"/>
-            <w:b/>
-            <w:bCs/>
-          </w:rPr>
-          <w:t>e</w:t>
-        </w:r>
-        <w:r>
-          <w:rPr>
-            <w:rStyle w:val="Hyperlink"/>
-            <w:rFonts w:ascii="Cambria" w:hAnsi="Cambria"/>
-            <w:b/>
-            <w:bCs/>
-          </w:rPr>
-          <w:t>rboard</w:t>
+          <w:t>https://www.prollm.ai/leaderboard</w:t>
         </w:r>
       </w:hyperlink>
     </w:p>
@@ -1467,7 +1290,6 @@
       <w:pPr>
         <w:rPr>
           <w:rFonts w:ascii="Cambria" w:hAnsi="Cambria"/>
-          <w:lang w:val="en-US"/>
         </w:rPr>
       </w:pPr>
       <w:hyperlink r:id="rId11" w:history="1">
@@ -1478,7 +1300,37 @@
             <w:b/>
             <w:bCs/>
           </w:rPr>
-          <w:t>Decision</w:t>
+          <w:t>Decision Log 3</w:t>
+        </w:r>
+      </w:hyperlink>
+      <w:r>
+        <w:rPr>
+          <w:rFonts w:ascii="Cambria" w:hAnsi="Cambria"/>
+        </w:rPr>
+        <w:t xml:space="preserve"> confirming API-based querying as the chosen method, ensuring consistency and reproducibility </w:t>
+      </w:r>
+    </w:p>
+    <w:p>
+      <w:pPr>
+        <w:rPr>
+          <w:rFonts w:ascii="Cambria" w:hAnsi="Cambria"/>
+        </w:rPr>
+      </w:pPr>
+      <w:r>
+        <w:rPr>
+          <w:rFonts w:ascii="Cambria" w:hAnsi="Cambria"/>
+        </w:rPr>
+        <w:t xml:space="preserve">The </w:t>
+      </w:r>
+      <w:hyperlink r:id="rId12" w:history="1">
+        <w:r>
+          <w:rPr>
+            <w:rStyle w:val="Hyperlink"/>
+            <w:rFonts w:ascii="Cambria" w:hAnsi="Cambria"/>
+            <w:b/>
+            <w:bCs/>
+          </w:rPr>
+          <w:t>Model Selection Researc</w:t>
         </w:r>
         <w:r>
           <w:rPr>
@@ -1486,25 +1338,26 @@
             <w:rFonts w:ascii="Cambria" w:hAnsi="Cambria"/>
             <w:b/>
             <w:bCs/>
+            <w:i/>
+            <w:iCs/>
           </w:rPr>
-          <w:t xml:space="preserve"> </w:t>
-        </w:r>
-        <w:r>
-          <w:rPr>
-            <w:rStyle w:val="Hyperlink"/>
-            <w:rFonts w:ascii="Cambria" w:hAnsi="Cambria"/>
-            <w:b/>
-            <w:bCs/>
-          </w:rPr>
-          <w:t>Log 3</w:t>
+          <w:t>h</w:t>
         </w:r>
       </w:hyperlink>
       <w:r>
         <w:rPr>
           <w:rFonts w:ascii="Cambria" w:hAnsi="Cambria"/>
         </w:rPr>
-        <w:t xml:space="preserve"> confirming API-based querying as the chosen method, ensuring consistency and reproducibility </w:t>
-      </w:r>
+        <w:t xml:space="preserve"> document supports and confirms the findings discussed in this research</w:t>
+      </w:r>
+    </w:p>
+    <w:p>
+      <w:pPr>
+        <w:rPr>
+          <w:rFonts w:ascii="Cambria" w:hAnsi="Cambria"/>
+          <w:lang w:val="en-US"/>
+        </w:rPr>
+      </w:pPr>
     </w:p>
     <w:p>
       <w:pPr>
@@ -1522,7 +1375,7 @@
           <w:bCs/>
         </w:rPr>
         <w:pict w14:anchorId="5D3188A6">
-          <v:rect id="_x0000_i1176" style="width:0;height:1.5pt" o:hralign="center" o:hrstd="t" o:hr="t" fillcolor="#a0a0a0" stroked="f"/>
+          <v:rect id="_x0000_i1032" style="width:0;height:1.5pt" o:hralign="center" o:hrstd="t" o:hr="t" fillcolor="#a0a0a0" stroked="f"/>
         </w:pict>
       </w:r>
     </w:p>
@@ -1803,7 +1656,7 @@
           <w:rFonts w:ascii="Cambria" w:hAnsi="Cambria"/>
         </w:rPr>
         <w:pict w14:anchorId="50543327">
-          <v:rect id="_x0000_i1177" style="width:0;height:1.5pt" o:hralign="center" o:hrstd="t" o:hr="t" fillcolor="#a0a0a0" stroked="f"/>
+          <v:rect id="_x0000_i1033" style="width:0;height:1.5pt" o:hralign="center" o:hrstd="t" o:hr="t" fillcolor="#a0a0a0" stroked="f"/>
         </w:pict>
       </w:r>
     </w:p>
@@ -1842,42 +1695,6 @@
           <w:rFonts w:ascii="Cambria" w:hAnsi="Cambria"/>
         </w:rPr>
       </w:pPr>
-      <w:r>
-        <w:rPr>
-          <w:rFonts w:ascii="Segoe UI Symbol" w:hAnsi="Segoe UI Symbol" w:cs="Segoe UI Symbol"/>
-        </w:rPr>
-        <w:t>✔</w:t>
-      </w:r>
-      <w:r>
-        <w:rPr>
-          <w:rFonts w:ascii="Cambria" w:hAnsi="Cambria"/>
-        </w:rPr>
-        <w:t xml:space="preserve"> Reflects latest technological advancements instead of older baselines</w:t>
-      </w:r>
-      <w:r>
-        <w:rPr>
-          <w:rFonts w:ascii="Cambria" w:hAnsi="Cambria"/>
-        </w:rPr>
-        <w:br/>
-      </w:r>
-      <w:r>
-        <w:rPr>
-          <w:rFonts w:ascii="Segoe UI Symbol" w:hAnsi="Segoe UI Symbol" w:cs="Segoe UI Symbol"/>
-        </w:rPr>
-        <w:t>✔</w:t>
-      </w:r>
-      <w:r>
-        <w:rPr>
-          <w:rFonts w:ascii="Cambria" w:hAnsi="Cambria"/>
-        </w:rPr>
-        <w:t xml:space="preserve"> Aligns with API-based execution, ensuring feasibility</w:t>
-      </w:r>
-      <w:r>
-        <w:rPr>
-          <w:rFonts w:ascii="Cambria" w:hAnsi="Cambria"/>
-        </w:rPr>
-        <w:br/>
-      </w:r>
       <w:r>
         <w:rPr>
           <w:rFonts w:ascii="Segoe UI Symbol" w:hAnsi="Segoe UI Symbol" w:cs="Segoe UI Symbol"/>
@@ -1889,6 +1706,42 @@
         <w:rPr>
           <w:rFonts w:ascii="Cambria" w:hAnsi="Cambria"/>
         </w:rPr>
+        <w:t xml:space="preserve"> Reflects latest technological advancements instead of older baselines</w:t>
+      </w:r>
+      <w:r>
+        <w:rPr>
+          <w:rFonts w:ascii="Cambria" w:hAnsi="Cambria"/>
+        </w:rPr>
+        <w:br/>
+      </w:r>
+      <w:r>
+        <w:rPr>
+          <w:rFonts w:ascii="Segoe UI Symbol" w:hAnsi="Segoe UI Symbol" w:cs="Segoe UI Symbol"/>
+        </w:rPr>
+        <w:t>✔</w:t>
+      </w:r>
+      <w:r>
+        <w:rPr>
+          <w:rFonts w:ascii="Cambria" w:hAnsi="Cambria"/>
+        </w:rPr>
+        <w:t xml:space="preserve"> Aligns with API-based execution, ensuring feasibility</w:t>
+      </w:r>
+      <w:r>
+        <w:rPr>
+          <w:rFonts w:ascii="Cambria" w:hAnsi="Cambria"/>
+        </w:rPr>
+        <w:br/>
+      </w:r>
+      <w:r>
+        <w:rPr>
+          <w:rFonts w:ascii="Segoe UI Symbol" w:hAnsi="Segoe UI Symbol" w:cs="Segoe UI Symbol"/>
+        </w:rPr>
+        <w:t>✔</w:t>
+      </w:r>
+      <w:r>
+        <w:rPr>
+          <w:rFonts w:ascii="Cambria" w:hAnsi="Cambria"/>
+        </w:rPr>
         <w:t xml:space="preserve"> Ensures models are verified through official websites and API platforms and accessible in practice</w:t>
       </w:r>
       <w:r>
@@ -1940,7 +1793,7 @@
           <w:rFonts w:ascii="Cambria" w:hAnsi="Cambria"/>
         </w:rPr>
         <w:pict w14:anchorId="493B39C2">
-          <v:rect id="_x0000_i1178" style="width:0;height:1.5pt" o:hralign="center" o:hrstd="t" o:hr="t" fillcolor="#a0a0a0" stroked="f"/>
+          <v:rect id="_x0000_i1034" style="width:0;height:1.5pt" o:hralign="center" o:hrstd="t" o:hr="t" fillcolor="#a0a0a0" stroked="f"/>
         </w:pict>
       </w:r>
     </w:p>
@@ -1983,7 +1836,7 @@
           <w:rFonts w:ascii="Cambria" w:hAnsi="Cambria"/>
         </w:rPr>
         <w:pict w14:anchorId="7EC51E7A">
-          <v:rect id="_x0000_i1131" style="width:0;height:1.5pt" o:hralign="center" o:hrstd="t" o:hr="t" fillcolor="#a0a0a0" stroked="f"/>
+          <v:rect id="_x0000_i1035" style="width:0;height:1.5pt" o:hralign="center" o:hrstd="t" o:hr="t" fillcolor="#a0a0a0" stroked="f"/>
         </w:pict>
       </w:r>
     </w:p>
@@ -1998,13 +1851,7 @@
         <w:rPr>
           <w:rFonts w:ascii="Calibri" w:hAnsi="Calibri" w:cs="Calibri"/>
         </w:rPr>
-        <w:t>6</w:t>
-      </w:r>
-      <w:r>
-        <w:rPr>
-          <w:rFonts w:ascii="Calibri" w:hAnsi="Calibri" w:cs="Calibri"/>
-        </w:rPr>
-        <w:t>. Evaluation of the Decision</w:t>
+        <w:t>6. Evaluation of the Decision</w:t>
       </w:r>
     </w:p>
     <w:p>
@@ -2189,7 +2036,7 @@
           <w:rFonts w:ascii="Cambria" w:hAnsi="Cambria"/>
         </w:rPr>
         <w:pict w14:anchorId="6B2F26BA">
-          <v:rect id="_x0000_i1132" style="width:0;height:1.5pt" o:hralign="center" o:hrstd="t" o:hr="t" fillcolor="#a0a0a0" stroked="f"/>
+          <v:rect id="_x0000_i1036" style="width:0;height:1.5pt" o:hralign="center" o:hrstd="t" o:hr="t" fillcolor="#a0a0a0" stroked="f"/>
         </w:pict>
       </w:r>
     </w:p>
@@ -2249,7 +2096,7 @@
           <w:rFonts w:ascii="Cambria" w:hAnsi="Cambria"/>
         </w:rPr>
         <w:pict w14:anchorId="0AEDA9E1">
-          <v:rect id="_x0000_i1133" style="width:0;height:1.5pt" o:hralign="center" o:hrstd="t" o:hr="t" fillcolor="#a0a0a0" stroked="f"/>
+          <v:rect id="_x0000_i1037" style="width:0;height:1.5pt" o:hralign="center" o:hrstd="t" o:hr="t" fillcolor="#a0a0a0" stroked="f"/>
         </w:pict>
       </w:r>
     </w:p>
@@ -2293,6 +2140,7 @@
         <w:rPr>
           <w:rFonts w:ascii="Cambria" w:hAnsi="Cambria"/>
         </w:rPr>
+        <w:lastRenderedPageBreak/>
         <w:t>Additionally, the decision to use API-based querying (Decision Log 3) influenced model selection, as it requires models to be programmatically accessible and consistent.</w:t>
       </w:r>
     </w:p>
@@ -2306,7 +2154,6 @@
         <w:rPr>
           <w:rFonts w:ascii="Cambria" w:hAnsi="Cambria"/>
         </w:rPr>
-        <w:lastRenderedPageBreak/>
         <w:t>This led to a shift in thinking from:</w:t>
       </w:r>
     </w:p>
@@ -2360,7 +2207,7 @@
           <w:rFonts w:ascii="Cambria" w:hAnsi="Cambria"/>
         </w:rPr>
         <w:pict w14:anchorId="5A9ADD66">
-          <v:rect id="_x0000_i1134" style="width:0;height:1.5pt" o:hralign="center" o:hrstd="t" o:hr="t" fillcolor="#a0a0a0" stroked="f"/>
+          <v:rect id="_x0000_i1038" style="width:0;height:1.5pt" o:hralign="center" o:hrstd="t" o:hr="t" fillcolor="#a0a0a0" stroked="f"/>
         </w:pict>
       </w:r>
     </w:p>
@@ -2417,7 +2264,7 @@
           <w:rFonts w:ascii="Cambria" w:hAnsi="Cambria"/>
         </w:rPr>
         <w:pict w14:anchorId="022C88E5">
-          <v:rect id="_x0000_i1135" style="width:0;height:1.5pt" o:hralign="center" o:hrstd="t" o:hr="t" fillcolor="#a0a0a0" stroked="f"/>
+          <v:rect id="_x0000_i1039" style="width:0;height:1.5pt" o:hralign="center" o:hrstd="t" o:hr="t" fillcolor="#a0a0a0" stroked="f"/>
         </w:pict>
       </w:r>
     </w:p>
@@ -2483,7 +2330,7 @@
           <w:rFonts w:ascii="Cambria" w:hAnsi="Cambria"/>
         </w:rPr>
         <w:pict w14:anchorId="018C6FD1">
-          <v:rect id="_x0000_i1136" style="width:0;height:1.5pt" o:hralign="center" o:hrstd="t" o:hr="t" fillcolor="#a0a0a0" stroked="f"/>
+          <v:rect id="_x0000_i1040" style="width:0;height:1.5pt" o:hralign="center" o:hrstd="t" o:hr="t" fillcolor="#a0a0a0" stroked="f"/>
         </w:pict>
       </w:r>
     </w:p>
@@ -4359,6 +4206,7 @@
   <w:style w:type="character" w:default="1" w:styleId="DefaultParagraphFont">
     <w:name w:val="Default Paragraph Font"/>
     <w:uiPriority w:val="1"/>
+    <w:semiHidden/>
     <w:unhideWhenUsed/>
   </w:style>
   <w:style w:type="table" w:default="1" w:styleId="TableNormal">

</xml_diff>